<commit_message>
Document the DQ/ZQ matrix validation and the two MQ-block fixes
- docs/Simulator_vs_ChemEx_Matrix_Comparison.docx: new Section 10 covering
  the 30x30 comparison against ChemEx's cpmg_hn_dq_zq basis, the two bugs
  it exposed (mu_mq sign, spurious piJ), their origin in transcribing
  Allard Eq. [19], the post-fix exact match, and an impact table showing
  the in-phase results are unchanged.
- docs/CPMG_GroupMeeting_v2_with_Jblind_slide.pptx: two new slides (19, 20)
  covering the stronger test and the two bugs; the status slide now states
  the exact 900-element match instead of the older 0.03% figure, and the
  "read the source" lesson mentions the DQ/ZQ model.
- docs/group_meeting_figs/gm_dqzq_matrix_match.png: before/after difference
  maps for the 30x30 comparison.
- tests/make_dqzq_matrix_figure.py: regenerates that figure.
</commit_message>
<xml_diff>
--- a/docs/Simulator_vs_ChemEx_Matrix_Comparison.docx
+++ b/docs/Simulator_vs_ChemEx_Matrix_Comparison.docx
@@ -12098,6 +12098,896 @@
           <w:szCs w:val="18"/>
         </w:rPr>
         <w:t xml:space="preserve">All numerical values in this report were generated directly from the two codebases; no figures were transcribed by hand.</w:t>
+      </w:r>
+    </w:p>
+    <w:p>
+      <w:r>
+        <w:br w:type="page"/>
+      </w:r>
+    </w:p>
+    <w:p>
+      <w:pPr>
+        <w:spacing w:after="140" w:line="276"/>
+      </w:pPr>
+      <w:r>
+        <w:rPr>
+          <w:b/>
+          <w:bCs/>
+          <w:color w:val="1F4E79"/>
+          <w:sz w:val="30"/>
+          <w:szCs w:val="30"/>
+        </w:rPr>
+        <w:t xml:space="preserve">10.  Validation against ChemEx’s full 15-operator basis</w:t>
+      </w:r>
+    </w:p>
+    <w:p>
+      <w:pPr>
+        <w:spacing w:after="120" w:line="276"/>
+      </w:pPr>
+      <w:r>
+        <w:rPr>
+          <w:color w:val="1A1A2E"/>
+          <w:sz w:val="21"/>
+          <w:szCs w:val="21"/>
+        </w:rPr>
+        <w:t xml:space="preserve">Sections 5–6 compared our simulator against ChemEx’s cpmg_15n_ip experiment, whose basis holds only three operators per state. That comparison could only be made in a collapsed limit, and it therefore left the majority of our 16-operator matrix untested. ChemEx, however, also ships cpmg_hn_dq_zq, which declares Basis(type="ixyzsxyz") — fifteen operators per state, containing every term ours does: antiphase coherences, multiple-quantum coherences, cross-correlation and scalar coupling.</w:t>
+      </w:r>
+    </w:p>
+    <w:p>
+      <w:pPr>
+        <w:spacing w:after="120" w:line="276"/>
+      </w:pPr>
+      <w:r>
+        <w:rPr>
+          <w:color w:val="1A1A2E"/>
+          <w:sz w:val="21"/>
+          <w:szCs w:val="21"/>
+        </w:rPr>
+        <w:t xml:space="preserve">This permits a direct, one-to-one comparison of the matrix equations, with no collapsing and no pulse sequence involved. Dropping our identity operator (row/column 0, which carries only the R₁ equilibrium-recovery source terms and has no counterpart in ChemEx’s basis) leaves 15 operators per state, i.e. 30 × 30 with two-site exchange on both sides.</w:t>
+      </w:r>
+    </w:p>
+    <w:p>
+      <w:pPr>
+        <w:spacing w:after="120" w:line="276"/>
+      </w:pPr>
+      <w:r>
+        <w:rPr>
+          <w:b/>
+          <w:bCs/>
+          <w:color w:val="2E5F8A"/>
+          <w:sz w:val="24"/>
+          <w:szCs w:val="24"/>
+        </w:rPr>
+        <w:t xml:space="preserve">10.1  Method</w:t>
+      </w:r>
+    </w:p>
+    <w:p>
+      <w:pPr>
+        <w:spacing w:after="120" w:line="276"/>
+      </w:pPr>
+      <w:r>
+        <w:rPr>
+          <w:color w:val="1A1A2E"/>
+          <w:sz w:val="21"/>
+          <w:szCs w:val="21"/>
+        </w:rPr>
+        <w:t xml:space="preserve">Every relaxation rate was read directly off our own matrix at its canonical position and passed to ChemEx as an explicit parameter, so that no rate formula was re-derived by hand. The chemical shift was supplied in ppm chosen to reproduce our Δω exactly, so the known 0.03 % gyromagnetic-ratio convention difference (Section 6.5) could not contaminate the structural comparison.</w:t>
+      </w:r>
+    </w:p>
+    <w:p>
+      <w:pPr>
+        <w:shd w:val="clear" w:color="auto" w:fill="F2F2F2"/>
+        <w:spacing w:after="0" w:line="276"/>
+        <w:ind w:left="260"/>
+      </w:pPr>
+      <w:r>
+        <w:rPr>
+          <w:rFonts w:ascii="Consolas" w:hAnsi="Consolas"/>
+          <w:color w:val="1A1A2E"/>
+          <w:sz w:val="15"/>
+          <w:szCs w:val="15"/>
+        </w:rPr>
+        <w:t xml:space="preserve">our basis   : E Hx Hy Hz Nx Ny Nz 2HxNz 2HyNz 2HzNx 2HzNy</w:t>
+      </w:r>
+    </w:p>
+    <w:p>
+      <w:pPr>
+        <w:shd w:val="clear" w:color="auto" w:fill="F2F2F2"/>
+        <w:spacing w:after="0" w:line="276"/>
+        <w:ind w:left="260"/>
+      </w:pPr>
+      <w:r>
+        <w:rPr>
+          <w:rFonts w:ascii="Consolas" w:hAnsi="Consolas"/>
+          <w:color w:val="1A1A2E"/>
+          <w:sz w:val="15"/>
+          <w:szCs w:val="15"/>
+        </w:rPr>
+        <w:t xml:space="preserve">              2HxNx 2HxNy 2HyNx 2HyNy 2HzNz</w:t>
+      </w:r>
+    </w:p>
+    <w:p>
+      <w:pPr>
+        <w:shd w:val="clear" w:color="auto" w:fill="F2F2F2"/>
+        <w:spacing w:after="0" w:line="276"/>
+        <w:ind w:left="260"/>
+      </w:pPr>
+      <w:r>
+        <w:rPr>
+          <w:rFonts w:ascii="Consolas" w:hAnsi="Consolas"/>
+          <w:color w:val="1A1A2E"/>
+          <w:sz w:val="15"/>
+          <w:szCs w:val="15"/>
+        </w:rPr>
+        <w:t xml:space="preserve">ChemEx basis: ix iy iz sx sy sz 2ixsz 2iysz 2izsx 2izsy</w:t>
+      </w:r>
+    </w:p>
+    <w:p>
+      <w:pPr>
+        <w:shd w:val="clear" w:color="auto" w:fill="F2F2F2"/>
+        <w:spacing w:after="0" w:line="276"/>
+        <w:ind w:left="260"/>
+      </w:pPr>
+      <w:r>
+        <w:rPr>
+          <w:rFonts w:ascii="Consolas" w:hAnsi="Consolas"/>
+          <w:color w:val="1A1A2E"/>
+          <w:sz w:val="15"/>
+          <w:szCs w:val="15"/>
+        </w:rPr>
+        <w:t xml:space="preserve">              2ixsx 2ixsy 2iysx 2iysy 2izsz      (i = 15N, s = 1H)</w:t>
+      </w:r>
+    </w:p>
+    <w:p>
+      <w:pPr>
+        <w:spacing w:after="60" w:line="276"/>
+      </w:pPr>
+      <w:r>
+        <w:rPr>
+          <w:color w:val="1A1A2E"/>
+          <w:sz w:val="8"/>
+          <w:szCs w:val="8"/>
+        </w:rPr>
+        <w:t xml:space="preserve"> </w:t>
+      </w:r>
+    </w:p>
+    <w:p>
+      <w:pPr>
+        <w:spacing w:after="120" w:line="276"/>
+      </w:pPr>
+      <w:r>
+        <w:rPr>
+          <w:b/>
+          <w:bCs/>
+          <w:color w:val="2E5F8A"/>
+          <w:sz w:val="24"/>
+          <w:szCs w:val="24"/>
+        </w:rPr>
+        <w:t xml:space="preserve">10.2  Result: two real bugs in our implementation</w:t>
+      </w:r>
+    </w:p>
+    <w:p>
+      <w:pPr>
+        <w:spacing w:after="120" w:line="276"/>
+      </w:pPr>
+      <w:r>
+        <w:rPr>
+          <w:color w:val="1A1A2E"/>
+          <w:sz w:val="21"/>
+          <w:szCs w:val="21"/>
+        </w:rPr>
+        <w:t xml:space="preserve">892 of the 900 elements matched immediately, to machine precision. The eight that did not were all in the multiple-quantum block, and every one differed by exactly π·J. Investigating them exposed two independent defects — both in our code, not ChemEx’s.</w:t>
+      </w:r>
+    </w:p>
+    <w:tbl>
+      <w:tblPr>
+        <w:tblW w:w="9359" w:type="dxa"/>
+        <w:tblBorders>
+          <w:top w:val="single" w:sz="4" w:color="D8E2EA"/>
+          <w:left w:val="single" w:sz="4" w:color="D8E2EA"/>
+          <w:bottom w:val="single" w:sz="4" w:color="D8E2EA"/>
+          <w:right w:val="single" w:sz="4" w:color="D8E2EA"/>
+          <w:insideH w:val="single" w:sz="4" w:color="D8E2EA"/>
+          <w:insideV w:val="single" w:sz="4" w:color="D8E2EA"/>
+        </w:tblBorders>
+      </w:tblPr>
+      <w:tblGrid>
+        <w:gridCol w:w="1944"/>
+        <w:gridCol w:w="3744"/>
+        <w:gridCol w:w="3671"/>
+      </w:tblGrid>
+      <w:tr>
+        <w:tc>
+          <w:tcPr>
+            <w:tcW w:w="1944" w:type="dxa"/>
+            <w:shd w:val="clear" w:color="auto" w:fill="DCE6F1"/>
+          </w:tcPr>
+          <w:p>
+            <w:pPr>
+              <w:spacing w:after="0" w:line="240"/>
+            </w:pPr>
+            <w:r>
+              <w:rPr>
+                <w:b/>
+                <w:bCs/>
+                <w:sz w:val="19"/>
+                <w:szCs w:val="19"/>
+              </w:rPr>
+              <w:t xml:space="preserve"/>
+            </w:r>
+          </w:p>
+        </w:tc>
+        <w:tc>
+          <w:tcPr>
+            <w:tcW w:w="3744" w:type="dxa"/>
+            <w:shd w:val="clear" w:color="auto" w:fill="DCE6F1"/>
+          </w:tcPr>
+          <w:p>
+            <w:pPr>
+              <w:spacing w:after="0" w:line="240"/>
+            </w:pPr>
+            <w:r>
+              <w:rPr>
+                <w:b/>
+                <w:bCs/>
+                <w:sz w:val="19"/>
+                <w:szCs w:val="19"/>
+              </w:rPr>
+              <w:t xml:space="preserve">Bug 1 — μ_mq sign</w:t>
+            </w:r>
+          </w:p>
+        </w:tc>
+        <w:tc>
+          <w:tcPr>
+            <w:tcW w:w="3671" w:type="dxa"/>
+            <w:shd w:val="clear" w:color="auto" w:fill="DCE6F1"/>
+          </w:tcPr>
+          <w:p>
+            <w:pPr>
+              <w:spacing w:after="0" w:line="240"/>
+            </w:pPr>
+            <w:r>
+              <w:rPr>
+                <w:b/>
+                <w:bCs/>
+                <w:sz w:val="19"/>
+                <w:szCs w:val="19"/>
+              </w:rPr>
+              <w:t xml:space="preserve">Bug 2 — spurious πJ</w:t>
+            </w:r>
+          </w:p>
+        </w:tc>
+      </w:tr>
+      <w:tr>
+        <w:tc>
+          <w:tcPr>
+            <w:tcW w:w="1944" w:type="dxa"/>
+          </w:tcPr>
+          <w:p>
+            <w:pPr>
+              <w:spacing w:after="0" w:line="240"/>
+            </w:pPr>
+            <w:r>
+              <w:rPr>
+                <w:sz w:val="19"/>
+                <w:szCs w:val="19"/>
+              </w:rPr>
+              <w:t xml:space="preserve">What was wrong</w:t>
+            </w:r>
+          </w:p>
+        </w:tc>
+        <w:tc>
+          <w:tcPr>
+            <w:tcW w:w="3744" w:type="dxa"/>
+          </w:tcPr>
+          <w:p>
+            <w:pPr>
+              <w:spacing w:after="0" w:line="240"/>
+            </w:pPr>
+            <w:r>
+              <w:rPr>
+                <w:sz w:val="19"/>
+                <w:szCs w:val="19"/>
+              </w:rPr>
+              <w:t xml:space="preserve">l_mat[11,14] and l_mat[12,13] carried the wrong sign.</w:t>
+            </w:r>
+          </w:p>
+        </w:tc>
+        <w:tc>
+          <w:tcPr>
+            <w:tcW w:w="3671" w:type="dxa"/>
+          </w:tcPr>
+          <w:p>
+            <w:pPr>
+              <w:spacing w:after="0" w:line="240"/>
+            </w:pPr>
+            <w:r>
+              <w:rPr>
+                <w:sz w:val="19"/>
+                <w:szCs w:val="19"/>
+              </w:rPr>
+              <w:t xml:space="preserve">Four lines added ±πJ to the multiple-quantum block.</w:t>
+            </w:r>
+          </w:p>
+        </w:tc>
+      </w:tr>
+      <w:tr>
+        <w:tc>
+          <w:tcPr>
+            <w:tcW w:w="1944" w:type="dxa"/>
+            <w:shd w:val="clear" w:color="auto" w:fill="FAFAFA"/>
+          </w:tcPr>
+          <w:p>
+            <w:pPr>
+              <w:spacing w:after="0" w:line="240"/>
+            </w:pPr>
+            <w:r>
+              <w:rPr>
+                <w:sz w:val="19"/>
+                <w:szCs w:val="19"/>
+              </w:rPr>
+              <w:t xml:space="preserve">Origin</w:t>
+            </w:r>
+          </w:p>
+        </w:tc>
+        <w:tc>
+          <w:tcPr>
+            <w:tcW w:w="3744" w:type="dxa"/>
+            <w:shd w:val="clear" w:color="auto" w:fill="FAFAFA"/>
+          </w:tcPr>
+          <w:p>
+            <w:pPr>
+              <w:spacing w:after="0" w:line="240"/>
+            </w:pPr>
+            <w:r>
+              <w:rPr>
+                <w:sz w:val="19"/>
+                <w:szCs w:val="19"/>
+              </w:rPr>
+              <w:t xml:space="preserve">Allard Eq. [19] is written dσ/dt = −P·σ, so every printed element must be negated on the way into the code. The μ_mq entries were transcribed with the printed signs instead.</w:t>
+            </w:r>
+          </w:p>
+        </w:tc>
+        <w:tc>
+          <w:tcPr>
+            <w:tcW w:w="3671" w:type="dxa"/>
+            <w:shd w:val="clear" w:color="auto" w:fill="FAFAFA"/>
+          </w:tcPr>
+          <w:p>
+            <w:pPr>
+              <w:spacing w:after="0" w:line="240"/>
+            </w:pPr>
+            <w:r>
+              <w:rPr>
+                <w:sz w:val="19"/>
+                <w:szCs w:val="19"/>
+              </w:rPr>
+              <w:t xml:space="preserve">Not present in Eq. [19] at all. Most likely an over-generalisation from the in-phase and antiphase blocks, where πJ does legitimately appear.</w:t>
+            </w:r>
+          </w:p>
+        </w:tc>
+      </w:tr>
+      <w:tr>
+        <w:tc>
+          <w:tcPr>
+            <w:tcW w:w="1944" w:type="dxa"/>
+          </w:tcPr>
+          <w:p>
+            <w:pPr>
+              <w:spacing w:after="0" w:line="240"/>
+            </w:pPr>
+            <w:r>
+              <w:rPr>
+                <w:sz w:val="19"/>
+                <w:szCs w:val="19"/>
+              </w:rPr>
+              <w:t xml:space="preserve">Consequence</w:t>
+            </w:r>
+          </w:p>
+        </w:tc>
+        <w:tc>
+          <w:tcPr>
+            <w:tcW w:w="3744" w:type="dxa"/>
+          </w:tcPr>
+          <w:p>
+            <w:pPr>
+              <w:spacing w:after="0" w:line="240"/>
+            </w:pPr>
+            <w:r>
+              <w:rPr>
+                <w:sz w:val="19"/>
+                <w:szCs w:val="19"/>
+              </w:rPr>
+              <w:t xml:space="preserve">The DQ and ZQ relaxation rates were swapped.</w:t>
+            </w:r>
+          </w:p>
+        </w:tc>
+        <w:tc>
+          <w:tcPr>
+            <w:tcW w:w="3671" w:type="dxa"/>
+          </w:tcPr>
+          <w:p>
+            <w:pPr>
+              <w:spacing w:after="0" w:line="240"/>
+            </w:pPr>
+            <w:r>
+              <w:rPr>
+                <w:sz w:val="19"/>
+                <w:szCs w:val="19"/>
+              </w:rPr>
+              <w:t xml:space="preserve">J-coupling appeared to split DQ/ZQ, which it cannot.</w:t>
+            </w:r>
+          </w:p>
+        </w:tc>
+      </w:tr>
+      <w:tr>
+        <w:tc>
+          <w:tcPr>
+            <w:tcW w:w="1944" w:type="dxa"/>
+            <w:shd w:val="clear" w:color="auto" w:fill="FAFAFA"/>
+          </w:tcPr>
+          <w:p>
+            <w:pPr>
+              <w:spacing w:after="0" w:line="240"/>
+            </w:pPr>
+            <w:r>
+              <w:rPr>
+                <w:sz w:val="19"/>
+                <w:szCs w:val="19"/>
+              </w:rPr>
+              <w:t xml:space="preserve">Verification</w:t>
+            </w:r>
+          </w:p>
+        </w:tc>
+        <w:tc>
+          <w:tcPr>
+            <w:tcW w:w="3744" w:type="dxa"/>
+            <w:shd w:val="clear" w:color="auto" w:fill="FAFAFA"/>
+          </w:tcPr>
+          <w:p>
+            <w:pPr>
+              <w:spacing w:after="0" w:line="240"/>
+            </w:pPr>
+            <w:r>
+              <w:rPr>
+                <w:sz w:val="19"/>
+                <w:szCs w:val="19"/>
+              </w:rPr>
+              <w:t xml:space="preserve">Redfield requires R_DQ − R_ZQ = +2μ_mq with μ_mq &gt; 0; we produced −2μ_mq.</w:t>
+            </w:r>
+          </w:p>
+        </w:tc>
+        <w:tc>
+          <w:tcPr>
+            <w:tcW w:w="3671" w:type="dxa"/>
+            <w:shd w:val="clear" w:color="auto" w:fill="FAFAFA"/>
+          </w:tcPr>
+          <w:p>
+            <w:pPr>
+              <w:spacing w:after="0" w:line="240"/>
+            </w:pPr>
+            <w:r>
+              <w:rPr>
+                <w:sz w:val="19"/>
+                <w:szCs w:val="19"/>
+              </w:rPr>
+              <w:t xml:space="preserve">2πJ·IzSz commutes exactly with all four MQ operators (checked numerically with explicit spin matrices), so J cannot connect them.</w:t>
+            </w:r>
+          </w:p>
+        </w:tc>
+      </w:tr>
+    </w:tbl>
+    <w:p>
+      <w:pPr>
+        <w:spacing w:after="60" w:line="276"/>
+      </w:pPr>
+      <w:r>
+        <w:rPr>
+          <w:color w:val="1A1A2E"/>
+          <w:sz w:val="8"/>
+          <w:szCs w:val="8"/>
+        </w:rPr>
+        <w:t xml:space="preserve"> </w:t>
+      </w:r>
+    </w:p>
+    <w:p>
+      <w:pPr>
+        <w:spacing w:after="120" w:line="276"/>
+      </w:pPr>
+      <w:r>
+        <w:rPr>
+          <w:color w:val="1A1A2E"/>
+          <w:sz w:val="21"/>
+          <w:szCs w:val="21"/>
+        </w:rPr>
+        <w:t xml:space="preserve">It is worth stressing that the rate formulae themselves were correct. Eq. [32] gives μ_mq = (1/36)·Ad²·[−½·J(ω_I−ω_S) + 3·J(ω_I+ω_S)], which our code reproduces exactly. Only the placement of that rate into the matrix was wrong — and the slip is an easy one to make, because the printed μ entries already carry explicit minus signs and so look as though they have already been negated. Every other element in the file applies the negation correctly.</w:t>
+      </w:r>
+    </w:p>
+    <w:p>
+      <w:pPr>
+        <w:spacing w:after="120" w:line="276"/>
+      </w:pPr>
+      <w:r>
+        <w:rPr>
+          <w:b/>
+          <w:bCs/>
+          <w:color w:val="2E5F8A"/>
+          <w:sz w:val="24"/>
+          <w:szCs w:val="24"/>
+        </w:rPr>
+        <w:t xml:space="preserve">10.3  After the fixes</w:t>
+      </w:r>
+    </w:p>
+    <w:p>
+      <w:pPr>
+        <w:spacing w:after="120" w:line="276"/>
+      </w:pPr>
+      <w:r>
+        <w:rPr>
+          <w:color w:val="1A1A2E"/>
+          <w:sz w:val="21"/>
+          <w:szCs w:val="21"/>
+        </w:rPr>
+        <w:t xml:space="preserve">With both corrected, the two matrices are identical on all 900 elements (maximum absolute difference exactly 0.0). Independent checks confirm the physics is now right:</w:t>
+      </w:r>
+    </w:p>
+    <w:p>
+      <w:pPr>
+        <w:shd w:val="clear" w:color="auto" w:fill="F2F2F2"/>
+        <w:spacing w:after="0" w:line="276"/>
+        <w:ind w:left="260"/>
+      </w:pPr>
+      <w:r>
+        <w:rPr>
+          <w:rFonts w:ascii="Consolas" w:hAnsi="Consolas"/>
+          <w:color w:val="1A1A2E"/>
+          <w:sz w:val="15"/>
+          <w:szCs w:val="15"/>
+        </w:rPr>
+        <w:t xml:space="preserve">R_DQ - R_ZQ           =  +0.059728 s-1    (Redfield 2*mu = +0.059728)   OK</w:t>
+      </w:r>
+    </w:p>
+    <w:p>
+      <w:pPr>
+        <w:shd w:val="clear" w:color="auto" w:fill="F2F2F2"/>
+        <w:spacing w:after="0" w:line="276"/>
+        <w:ind w:left="260"/>
+      </w:pPr>
+      <w:r>
+        <w:rPr>
+          <w:rFonts w:ascii="Consolas" w:hAnsi="Consolas"/>
+          <w:color w:val="1A1A2E"/>
+          <w:sz w:val="15"/>
+          <w:szCs w:val="15"/>
+        </w:rPr>
+        <w:t xml:space="preserve">MQ block vs J         :  max |L(J=92) - L(J=0)| = 0.0                   OK</w:t>
+      </w:r>
+    </w:p>
+    <w:p>
+      <w:pPr>
+        <w:shd w:val="clear" w:color="auto" w:fill="F2F2F2"/>
+        <w:spacing w:after="0" w:line="276"/>
+        <w:ind w:left="260"/>
+      </w:pPr>
+      <w:r>
+        <w:rPr>
+          <w:rFonts w:ascii="Consolas" w:hAnsi="Consolas"/>
+          <w:color w:val="1A1A2E"/>
+          <w:sz w:val="15"/>
+          <w:szCs w:val="15"/>
+        </w:rPr>
+        <w:t xml:space="preserve">full 30x30 vs ChemEx  :  max |ours - chemex|    = 0.0                   OK</w:t>
+      </w:r>
+    </w:p>
+    <w:p>
+      <w:pPr>
+        <w:spacing w:after="60" w:line="276"/>
+      </w:pPr>
+      <w:r>
+        <w:rPr>
+          <w:color w:val="1A1A2E"/>
+          <w:sz w:val="8"/>
+          <w:szCs w:val="8"/>
+        </w:rPr>
+        <w:t xml:space="preserve"> </w:t>
+      </w:r>
+    </w:p>
+    <w:p>
+      <w:pPr>
+        <w:spacing w:after="120" w:line="276"/>
+      </w:pPr>
+      <w:r>
+        <w:rPr>
+          <w:b/>
+          <w:bCs/>
+          <w:color w:val="2E5F8A"/>
+          <w:sz w:val="24"/>
+          <w:szCs w:val="24"/>
+        </w:rPr>
+        <w:t xml:space="preserve">10.4  Impact on results already reported</w:t>
+      </w:r>
+    </w:p>
+    <w:tbl>
+      <w:tblPr>
+        <w:tblW w:w="9360" w:type="dxa"/>
+        <w:tblBorders>
+          <w:top w:val="single" w:sz="4" w:color="D8E2EA"/>
+          <w:left w:val="single" w:sz="4" w:color="D8E2EA"/>
+          <w:bottom w:val="single" w:sz="4" w:color="D8E2EA"/>
+          <w:right w:val="single" w:sz="4" w:color="D8E2EA"/>
+          <w:insideH w:val="single" w:sz="4" w:color="D8E2EA"/>
+          <w:insideV w:val="single" w:sz="4" w:color="D8E2EA"/>
+        </w:tblBorders>
+      </w:tblPr>
+      <w:tblGrid>
+        <w:gridCol w:w="4320"/>
+        <w:gridCol w:w="2736"/>
+        <w:gridCol w:w="2304"/>
+      </w:tblGrid>
+      <w:tr>
+        <w:tc>
+          <w:tcPr>
+            <w:tcW w:w="4320" w:type="dxa"/>
+            <w:shd w:val="clear" w:color="auto" w:fill="DCE6F1"/>
+          </w:tcPr>
+          <w:p>
+            <w:pPr>
+              <w:spacing w:after="0" w:line="240"/>
+            </w:pPr>
+            <w:r>
+              <w:rPr>
+                <w:b/>
+                <w:bCs/>
+                <w:sz w:val="19"/>
+                <w:szCs w:val="19"/>
+              </w:rPr>
+              <w:t xml:space="preserve">Experiment</w:t>
+            </w:r>
+          </w:p>
+        </w:tc>
+        <w:tc>
+          <w:tcPr>
+            <w:tcW w:w="2736" w:type="dxa"/>
+            <w:shd w:val="clear" w:color="auto" w:fill="DCE6F1"/>
+          </w:tcPr>
+          <w:p>
+            <w:pPr>
+              <w:spacing w:after="0" w:line="240"/>
+            </w:pPr>
+            <w:r>
+              <w:rPr>
+                <w:b/>
+                <w:bCs/>
+                <w:sz w:val="19"/>
+                <w:szCs w:val="19"/>
+              </w:rPr>
+              <w:t xml:space="preserve">MQ block reached?</w:t>
+            </w:r>
+          </w:p>
+        </w:tc>
+        <w:tc>
+          <w:tcPr>
+            <w:tcW w:w="2304" w:type="dxa"/>
+            <w:shd w:val="clear" w:color="auto" w:fill="DCE6F1"/>
+          </w:tcPr>
+          <w:p>
+            <w:pPr>
+              <w:spacing w:after="0" w:line="240"/>
+            </w:pPr>
+            <w:r>
+              <w:rPr>
+                <w:b/>
+                <w:bCs/>
+                <w:sz w:val="19"/>
+                <w:szCs w:val="19"/>
+              </w:rPr>
+              <w:t xml:space="preserve">Affected?</w:t>
+            </w:r>
+          </w:p>
+        </w:tc>
+      </w:tr>
+      <w:tr>
+        <w:tc>
+          <w:tcPr>
+            <w:tcW w:w="4320" w:type="dxa"/>
+          </w:tcPr>
+          <w:p>
+            <w:pPr>
+              <w:spacing w:after="0" w:line="240"/>
+            </w:pPr>
+            <w:r>
+              <w:rPr>
+                <w:sz w:val="19"/>
+                <w:szCs w:val="19"/>
+              </w:rPr>
+              <w:t xml:space="preserve">In-phase ¹⁵N CPMG (our sequence)</w:t>
+            </w:r>
+          </w:p>
+        </w:tc>
+        <w:tc>
+          <w:tcPr>
+            <w:tcW w:w="2736" w:type="dxa"/>
+          </w:tcPr>
+          <w:p>
+            <w:pPr>
+              <w:spacing w:after="0" w:line="240"/>
+            </w:pPr>
+            <w:r>
+              <w:rPr>
+                <w:sz w:val="19"/>
+                <w:szCs w:val="19"/>
+              </w:rPr>
+              <w:t xml:space="preserve">no</w:t>
+            </w:r>
+          </w:p>
+        </w:tc>
+        <w:tc>
+          <w:tcPr>
+            <w:tcW w:w="2304" w:type="dxa"/>
+          </w:tcPr>
+          <w:p>
+            <w:pPr>
+              <w:spacing w:after="0" w:line="240"/>
+            </w:pPr>
+            <w:r>
+              <w:rPr>
+                <w:sz w:val="19"/>
+                <w:szCs w:val="19"/>
+              </w:rPr>
+              <w:t xml:space="preserve">unchanged</w:t>
+            </w:r>
+          </w:p>
+        </w:tc>
+      </w:tr>
+      <w:tr>
+        <w:tc>
+          <w:tcPr>
+            <w:tcW w:w="4320" w:type="dxa"/>
+            <w:shd w:val="clear" w:color="auto" w:fill="FAFAFA"/>
+          </w:tcPr>
+          <w:p>
+            <w:pPr>
+              <w:spacing w:after="0" w:line="240"/>
+            </w:pPr>
+            <w:r>
+              <w:rPr>
+                <w:sz w:val="19"/>
+                <w:szCs w:val="19"/>
+              </w:rPr>
+              <w:t xml:space="preserve">In-phase ¹⁵N CPMG (ChemEx sequence)</w:t>
+            </w:r>
+          </w:p>
+        </w:tc>
+        <w:tc>
+          <w:tcPr>
+            <w:tcW w:w="2736" w:type="dxa"/>
+            <w:shd w:val="clear" w:color="auto" w:fill="FAFAFA"/>
+          </w:tcPr>
+          <w:p>
+            <w:pPr>
+              <w:spacing w:after="0" w:line="240"/>
+            </w:pPr>
+            <w:r>
+              <w:rPr>
+                <w:sz w:val="19"/>
+                <w:szCs w:val="19"/>
+              </w:rPr>
+              <w:t xml:space="preserve">no</w:t>
+            </w:r>
+          </w:p>
+        </w:tc>
+        <w:tc>
+          <w:tcPr>
+            <w:tcW w:w="2304" w:type="dxa"/>
+            <w:shd w:val="clear" w:color="auto" w:fill="FAFAFA"/>
+          </w:tcPr>
+          <w:p>
+            <w:pPr>
+              <w:spacing w:after="0" w:line="240"/>
+            </w:pPr>
+            <w:r>
+              <w:rPr>
+                <w:sz w:val="19"/>
+                <w:szCs w:val="19"/>
+              </w:rPr>
+              <w:t xml:space="preserve">unchanged</w:t>
+            </w:r>
+          </w:p>
+        </w:tc>
+      </w:tr>
+      <w:tr>
+        <w:tc>
+          <w:tcPr>
+            <w:tcW w:w="4320" w:type="dxa"/>
+          </w:tcPr>
+          <w:p>
+            <w:pPr>
+              <w:spacing w:after="0" w:line="240"/>
+            </w:pPr>
+            <w:r>
+              <w:rPr>
+                <w:sz w:val="19"/>
+                <w:szCs w:val="19"/>
+              </w:rPr>
+              <w:t xml:space="preserve">CW-CPMG (¹H decoupling field)</w:t>
+            </w:r>
+          </w:p>
+        </w:tc>
+        <w:tc>
+          <w:tcPr>
+            <w:tcW w:w="2736" w:type="dxa"/>
+          </w:tcPr>
+          <w:p>
+            <w:pPr>
+              <w:spacing w:after="0" w:line="240"/>
+            </w:pPr>
+            <w:r>
+              <w:rPr>
+                <w:sz w:val="19"/>
+                <w:szCs w:val="19"/>
+              </w:rPr>
+              <w:t xml:space="preserve">yes</w:t>
+            </w:r>
+          </w:p>
+        </w:tc>
+        <w:tc>
+          <w:tcPr>
+            <w:tcW w:w="2304" w:type="dxa"/>
+          </w:tcPr>
+          <w:p>
+            <w:pPr>
+              <w:spacing w:after="0" w:line="240"/>
+            </w:pPr>
+            <w:r>
+              <w:rPr>
+                <w:sz w:val="19"/>
+                <w:szCs w:val="19"/>
+              </w:rPr>
+              <w:t xml:space="preserve">profiles shift slightly</w:t>
+            </w:r>
+          </w:p>
+        </w:tc>
+      </w:tr>
+    </w:tbl>
+    <w:p>
+      <w:pPr>
+        <w:spacing w:after="60" w:line="276"/>
+      </w:pPr>
+      <w:r>
+        <w:rPr>
+          <w:color w:val="1A1A2E"/>
+          <w:sz w:val="8"/>
+          <w:szCs w:val="8"/>
+        </w:rPr>
+        <w:t xml:space="preserve"> </w:t>
+      </w:r>
+    </w:p>
+    <w:p>
+      <w:pPr>
+        <w:spacing w:after="120" w:line="276"/>
+      </w:pPr>
+      <w:r>
+        <w:rPr>
+          <w:color w:val="1A1A2E"/>
+          <w:sz w:val="21"/>
+          <w:szCs w:val="21"/>
+        </w:rPr>
+        <w:t xml:space="preserve">Dependency closure from the observable confirms that the in-phase experiments never populate the multiple-quantum operators, under free precession or with the refocusing pulses. Every result in Sections 6–9 — the 6 × 6 validation, the ncyc/time_t2 correction, the 20.6 % physics gap and all fitted parameters — is therefore unchanged, and this was verified by re-running them after the fix. CW-CPMG does reach the block through the ¹H decoupling field, so its profiles shift by a small amount (15.3359 → 15.3176 s⁻¹ at ncyc = 1); those are now the corrected values.</w:t>
+      </w:r>
+    </w:p>
+    <w:p>
+      <w:pPr>
+        <w:spacing w:after="120" w:line="276"/>
+      </w:pPr>
+      <w:r>
+        <w:rPr>
+          <w:i/>
+          <w:iCs/>
+          <w:color w:val="555555"/>
+          <w:sz w:val="19"/>
+          <w:szCs w:val="19"/>
+        </w:rPr>
+        <w:t xml:space="preserve">Why this test mattered: it exercises every term in the matrix, including the ones the in-phase experiment can never reach. That is precisely why these two defects survived all of the earlier benchmarking, and it is why the comparison has been retained in the repository as a regression check (tests/compare_matrix_vs_chemex_dqzq.py).</w:t>
       </w:r>
     </w:p>
     <w:sectPr>

</xml_diff>